<commit_message>
Changes removed - Commented GitLatch Commit @ 2026-9-15-16-45-28-598
</commit_message>
<xml_diff>
--- a/INSY6212 - Assignment 2.docx
+++ b/INSY6212 - Assignment 2.docx
@@ -1121,14 +1121,6 @@
         <w:t>.</w:t>
       </w:r>
     </w:p>
-    <w:p>
-      <w:pPr>
-        <w:ind w:left="45"/>
-      </w:pPr>
-      <w:r>
-        <w:t>[Changes made]</w:t>
-      </w:r>
-    </w:p>
     <w:sectPr>
       <w:pgSz w:w="11906" w:h="16838"/>
       <w:pgMar w:top="1440" w:right="1440" w:bottom="1440" w:left="1440" w:header="708" w:footer="708" w:gutter="0"/>

</xml_diff>